<commit_message>
Build TK2 P1 DOCX
</commit_message>
<xml_diff>
--- a/tk2/P1.docx
+++ b/tk2/P1.docx
@@ -1225,7 +1225,7 @@
         <w:rPr>
           <w:sz w:val="18"/>
         </w:rPr>
-        <w:t>Tim kopiert Text von einer Webseite nach Word. Die fremde Schriftart und Formatierung soll möglichst nicht übernommen werden.</w:t>
+        <w:t>Tim kopiert Text von einer Webseite in ein Dokument. Die fremde Schriftart und Formatierung soll möglichst nicht übernommen werden.</w:t>
       </w:r>
     </w:p>
     <w:p>
@@ -1347,7 +1347,7 @@
           <w:color w:val="64748B"/>
           <w:sz w:val="19"/>
         </w:rPr>
-        <w:t>Ergänze jeweils die zweite Taste auf einer Schweizer Tastatur.</w:t>
+        <w:t>Ergänze jeweils die zweite Taste auf einer Schweizer Tastatur. Das Zielzeichen bleibt sichtbar; geprüft wird nur die zweite Taste zu AltGr.</w:t>
       </w:r>
     </w:p>
     <w:tbl>
@@ -2302,7 +2302,7 @@
         <w:keepNext/>
       </w:pPr>
       <w:r>
-        <w:t>6. In eigenen Sätzen</w:t>
+        <w:t>6. Kurz erklären</w:t>
       </w:r>
       <w:r>
         <w:rPr>
@@ -2322,7 +2322,7 @@
           <w:color w:val="64748B"/>
           <w:sz w:val="19"/>
         </w:rPr>
-        <w:t>Erkläre jeweils in einem eigenen Satz, was die Tastenkombination bewirkt. Je 1 Punkt.</w:t>
+        <w:t>Beschreibe kurz die Wirkung. Stichwort oder Satz genügt; bewertet wird der Inhalt. Je 1 Punkt.</w:t>
       </w:r>
     </w:p>
     <w:tbl>
@@ -2333,8 +2333,8 @@
         <w:tblLook w:firstColumn="1" w:firstRow="1" w:lastColumn="0" w:lastRow="0" w:noHBand="0" w:noVBand="1" w:val="04A0"/>
       </w:tblPr>
       <w:tblGrid>
-        <w:gridCol w:w="1871"/>
-        <w:gridCol w:w="7880"/>
+        <w:gridCol w:w="3175"/>
+        <w:gridCol w:w="6576"/>
       </w:tblGrid>
       <w:tr>
         <w:trPr>
@@ -2342,7 +2342,7 @@
         </w:trPr>
         <w:tc>
           <w:tcPr>
-            <w:tcW w:type="dxa" w:w="1871"/>
+            <w:tcW w:type="dxa" w:w="3175"/>
             <w:tcMar>
               <w:top w:w="105" w:type="dxa"/>
               <w:start w:w="90" w:type="dxa"/>
@@ -2360,13 +2360,13 @@
                 <w:color w:val="1D4ED8"/>
                 <w:sz w:val="18"/>
               </w:rPr>
-              <w:t>1. Ctrl + H</w:t>
+              <w:t>1. Ctrl + H in Word</w:t>
             </w:r>
           </w:p>
         </w:tc>
         <w:tc>
           <w:tcPr>
-            <w:tcW w:type="dxa" w:w="7880"/>
+            <w:tcW w:type="dxa" w:w="6576"/>
             <w:tcMar>
               <w:top w:w="105" w:type="dxa"/>
               <w:start w:w="90" w:type="dxa"/>
@@ -2382,7 +2382,7 @@
               <w:rPr>
                 <w:sz w:val="17"/>
               </w:rPr>
-              <w:t>________________________________________________________________</w:t>
+              <w:t>________________________________________________________</w:t>
             </w:r>
           </w:p>
         </w:tc>
@@ -2393,7 +2393,7 @@
         </w:trPr>
         <w:tc>
           <w:tcPr>
-            <w:tcW w:type="dxa" w:w="1871"/>
+            <w:tcW w:type="dxa" w:w="3175"/>
             <w:tcMar>
               <w:top w:w="105" w:type="dxa"/>
               <w:start w:w="90" w:type="dxa"/>
@@ -2417,7 +2417,7 @@
         </w:tc>
         <w:tc>
           <w:tcPr>
-            <w:tcW w:type="dxa" w:w="7880"/>
+            <w:tcW w:type="dxa" w:w="6576"/>
             <w:tcMar>
               <w:top w:w="105" w:type="dxa"/>
               <w:start w:w="90" w:type="dxa"/>
@@ -2433,7 +2433,7 @@
               <w:rPr>
                 <w:sz w:val="17"/>
               </w:rPr>
-              <w:t>________________________________________________________________</w:t>
+              <w:t>________________________________________________________</w:t>
             </w:r>
           </w:p>
         </w:tc>
@@ -2444,7 +2444,7 @@
         </w:trPr>
         <w:tc>
           <w:tcPr>
-            <w:tcW w:type="dxa" w:w="1871"/>
+            <w:tcW w:type="dxa" w:w="3175"/>
             <w:tcMar>
               <w:top w:w="105" w:type="dxa"/>
               <w:start w:w="90" w:type="dxa"/>
@@ -2468,7 +2468,7 @@
         </w:tc>
         <w:tc>
           <w:tcPr>
-            <w:tcW w:type="dxa" w:w="7880"/>
+            <w:tcW w:type="dxa" w:w="6576"/>
             <w:tcMar>
               <w:top w:w="105" w:type="dxa"/>
               <w:start w:w="90" w:type="dxa"/>
@@ -2484,7 +2484,7 @@
               <w:rPr>
                 <w:sz w:val="17"/>
               </w:rPr>
-              <w:t>________________________________________________________________</w:t>
+              <w:t>________________________________________________________</w:t>
             </w:r>
           </w:p>
         </w:tc>
@@ -2495,7 +2495,7 @@
         </w:trPr>
         <w:tc>
           <w:tcPr>
-            <w:tcW w:type="dxa" w:w="1871"/>
+            <w:tcW w:type="dxa" w:w="3175"/>
             <w:tcMar>
               <w:top w:w="105" w:type="dxa"/>
               <w:start w:w="90" w:type="dxa"/>
@@ -2519,7 +2519,7 @@
         </w:tc>
         <w:tc>
           <w:tcPr>
-            <w:tcW w:type="dxa" w:w="7880"/>
+            <w:tcW w:type="dxa" w:w="6576"/>
             <w:tcMar>
               <w:top w:w="105" w:type="dxa"/>
               <w:start w:w="90" w:type="dxa"/>
@@ -2535,7 +2535,7 @@
               <w:rPr>
                 <w:sz w:val="17"/>
               </w:rPr>
-              <w:t>________________________________________________________________</w:t>
+              <w:t>________________________________________________________</w:t>
             </w:r>
           </w:p>
         </w:tc>
@@ -2546,7 +2546,7 @@
         </w:trPr>
         <w:tc>
           <w:tcPr>
-            <w:tcW w:type="dxa" w:w="1871"/>
+            <w:tcW w:type="dxa" w:w="3175"/>
             <w:tcMar>
               <w:top w:w="105" w:type="dxa"/>
               <w:start w:w="90" w:type="dxa"/>
@@ -2570,7 +2570,7 @@
         </w:tc>
         <w:tc>
           <w:tcPr>
-            <w:tcW w:type="dxa" w:w="7880"/>
+            <w:tcW w:type="dxa" w:w="6576"/>
             <w:tcMar>
               <w:top w:w="105" w:type="dxa"/>
               <w:start w:w="90" w:type="dxa"/>
@@ -2586,7 +2586,7 @@
               <w:rPr>
                 <w:sz w:val="17"/>
               </w:rPr>
-              <w:t>________________________________________________________________</w:t>
+              <w:t>________________________________________________________</w:t>
             </w:r>
           </w:p>
         </w:tc>
@@ -2597,7 +2597,7 @@
         </w:trPr>
         <w:tc>
           <w:tcPr>
-            <w:tcW w:type="dxa" w:w="1871"/>
+            <w:tcW w:type="dxa" w:w="3175"/>
             <w:tcMar>
               <w:top w:w="105" w:type="dxa"/>
               <w:start w:w="90" w:type="dxa"/>
@@ -2615,13 +2615,13 @@
                 <w:color w:val="1D4ED8"/>
                 <w:sz w:val="18"/>
               </w:rPr>
-              <w:t>6. Win + ↓</w:t>
+              <w:t>6. Win + ↓ (Fenster maximiert)</w:t>
             </w:r>
           </w:p>
         </w:tc>
         <w:tc>
           <w:tcPr>
-            <w:tcW w:type="dxa" w:w="7880"/>
+            <w:tcW w:type="dxa" w:w="6576"/>
             <w:tcMar>
               <w:top w:w="105" w:type="dxa"/>
               <w:start w:w="90" w:type="dxa"/>
@@ -2637,7 +2637,7 @@
               <w:rPr>
                 <w:sz w:val="17"/>
               </w:rPr>
-              <w:t>________________________________________________________________</w:t>
+              <w:t>________________________________________________________</w:t>
             </w:r>
           </w:p>
         </w:tc>
@@ -2815,7 +2815,7 @@
         <w:keepNext/>
       </w:pPr>
       <w:r>
-        <w:t>A) Präsentation vorbereiten - 2 P</w:t>
+        <w:t>A) Zwei Programme nebeneinander - 2 P</w:t>
       </w:r>
     </w:p>
     <w:p>
@@ -2823,7 +2823,7 @@
         <w:rPr>
           <w:sz w:val="18"/>
         </w:rPr>
-        <w:t>Nina bereitet eine Präsentation vor. Im Browser recherchiert sie Informationen und in PowerPoint erstellt sie gleichzeitig ihre Folien. Sie möchte möglichst schnell zwischen Browser und PowerPoint wechseln, ohne die Maus zu verwenden.</w:t>
+        <w:t>Du arbeitest mit Browser und PowerPoint. Das aktive Browserfenster soll ohne Maus die rechte Bildschirmhälfte einnehmen, damit PowerPoint daneben sichtbar bleiben kann.</w:t>
       </w:r>
     </w:p>
     <w:p>
@@ -2938,9 +2938,9 @@
       <w:r>
         <w:rPr>
           <w:color w:val="64748B"/>
-          <w:sz w:val="19"/>
+          <w:sz w:val="18"/>
         </w:rPr>
-        <w:t>Zwei freiwillige Transferfragen. Jede richtige Lösung gibt +1 Bonuspunkt.</w:t>
+        <w:t>Die Bonusfragen verbinden ähnliche Tastenkombinationen und verlangen genaues Unterscheiden.</w:t>
       </w:r>
     </w:p>
     <w:p>
@@ -2948,7 +2948,7 @@
         <w:pStyle w:val="Heading2"/>
       </w:pPr>
       <w:r>
-        <w:t>Bonus 1 - Rettung nach Fehlklick (+1 P)</w:t>
+        <w:t>Bonus 1 - Im Browser bleiben (+1 P)</w:t>
       </w:r>
     </w:p>
     <w:p>
@@ -2956,7 +2956,7 @@
         <w:rPr>
           <w:sz w:val="18"/>
         </w:rPr>
-        <w:t>Lena recherchiert für eine Arbeit und schliesst versehentlich einen wichtigen Browser-Tab. Welche Tastenkombination bringt den zuletzt geschlossenen Tab zurück?</w:t>
+        <w:t>Du hast mehrere Browser-Tabs geöffnet und gleichzeitig Word. Du möchtest zum vorherigen Browser-Tab wechseln, ohne zu Word zu wechseln. Welche Tastenkombination verwendest du?</w:t>
       </w:r>
     </w:p>
     <w:p>
@@ -2976,7 +2976,7 @@
         <w:pStyle w:val="Heading2"/>
       </w:pPr>
       <w:r>
-        <w:t>Bonus 2 - Wo war der Anfang? (+1 P)</w:t>
+        <w:t>Bonus 2 - Fenster neu anordnen (+1 P)</w:t>
       </w:r>
     </w:p>
     <w:p>
@@ -2984,7 +2984,7 @@
         <w:rPr>
           <w:sz w:val="18"/>
         </w:rPr>
-        <w:t>Marco arbeitet an einem sehr langen Dokument und befindet sich fast ganz am Ende. Er möchte sofort wieder ganz an den Anfang springen. Welche Tastenkombination verwendet er?</w:t>
+        <w:t>Ein Fenster ist maximiert. Du möchtest es zuerst wieder auf normale Grösse bringen und danach links am Bildschirm andocken. Nenne die zwei Tastenkombinationen in der richtigen Reihenfolge.</w:t>
       </w:r>
     </w:p>
     <w:p>
@@ -3010,7 +3010,7 @@
     </w:p>
     <w:p>
       <w:pPr>
-        <w:spacing w:before="200"/>
+        <w:spacing w:before="160"/>
         <w:jc w:val="center"/>
       </w:pPr>
       <w:r>

</xml_diff>